<commit_message>
Described error responses in Swagger, redrew the class diagram after the compact sample and added the lab 4 report with the technical specification
</commit_message>
<xml_diff>
--- a/docs/lab3-corrections.docx
+++ b/docs/lab3-corrections.docx
@@ -80,9 +80,9 @@
         </w:rPr>
         <w:drawing>
           <wp:inline distT="0" distB="0" distL="0" distR="0">
-            <wp:extent cx="5940000" cy="3343214"/>
+            <wp:extent cx="5940000" cy="4245352"/>
             <wp:effectExtent l="0" t="0" r="0" b="0"/>
-            <wp:docPr id="1" name="Picture 1"/>
+            <wp:docPr id="101" name="Picture 1"/>
             <wp:cNvGraphicFramePr>
               <a:graphicFrameLocks xmlns:a="http://schemas.openxmlformats.org/drawingml/2006/main" noChangeAspect="1"/>
             </wp:cNvGraphicFramePr>
@@ -105,7 +105,7 @@
                   <pic:spPr bwMode="auto">
                     <a:xfrm>
                       <a:off x="0" y="0"/>
-                      <a:ext cx="5940000" cy="3343214"/>
+                      <a:ext cx="5940000" cy="4245352"/>
                     </a:xfrm>
                     <a:prstGeom prst="rect">
                       <a:avLst/>
@@ -129,7 +129,7 @@
           <w:szCs w:val="24"/>
           <w:lang w:val="ru-RU"/>
         </w:rPr>
-        <w:t xml:space="preserve">Рисунок 1 - Лента без ид, лайк есть</w:t>
+        <w:t>Рисунок 1 - Лента без ид, лайк есть</w:t>
       </w:r>
     </w:p>
     <w:p>
@@ -144,9 +144,9 @@
         </w:rPr>
         <w:drawing>
           <wp:inline distT="0" distB="0" distL="0" distR="0">
-            <wp:extent cx="5940000" cy="3343214"/>
+            <wp:extent cx="5940000" cy="4594764"/>
             <wp:effectExtent l="0" t="0" r="0" b="0"/>
-            <wp:docPr id="2" name="Picture 2"/>
+            <wp:docPr id="102" name="Picture 2"/>
             <wp:cNvGraphicFramePr>
               <a:graphicFrameLocks xmlns:a="http://schemas.openxmlformats.org/drawingml/2006/main" noChangeAspect="1"/>
             </wp:cNvGraphicFramePr>
@@ -169,7 +169,7 @@
                   <pic:spPr bwMode="auto">
                     <a:xfrm>
                       <a:off x="0" y="0"/>
-                      <a:ext cx="5940000" cy="3343214"/>
+                      <a:ext cx="5940000" cy="4594764"/>
                     </a:xfrm>
                     <a:prstGeom prst="rect">
                       <a:avLst/>
@@ -193,7 +193,7 @@
           <w:szCs w:val="24"/>
           <w:lang w:val="ru-RU"/>
         </w:rPr>
-        <w:t xml:space="preserve">Рисунок 2 - Лента по ид с next, лайка нет</w:t>
+        <w:t>Рисунок 2 - Лента по ид с next, лайка нет</w:t>
       </w:r>
     </w:p>
     <w:p>
@@ -243,7 +243,7 @@
         <w:rPr>
           <w:lang w:val="ru-RU"/>
         </w:rPr>
-        <w:t xml:space="preserve"> поле next_principality_id и второй запрос убраны; следующее княжество находит один ORM-запрос по ид из адреса и ?next=true.</w:t>
+        <w:t xml:space="preserve"> поле next_principality_id убрано; следующее княжество находит один ORM-запрос по ид из адреса и ?next=true, после последнего княжества лента возвращается к первому.</w:t>
       </w:r>
     </w:p>
     <w:p>
@@ -258,9 +258,73 @@
         </w:rPr>
         <w:drawing>
           <wp:inline distT="0" distB="0" distL="0" distR="0">
-            <wp:extent cx="5940000" cy="3339286"/>
+            <wp:extent cx="5940000" cy="2587535"/>
             <wp:effectExtent l="0" t="0" r="0" b="0"/>
-            <wp:docPr id="3" name="Picture 3"/>
+            <wp:docPr id="103" name="Picture 3"/>
+            <wp:cNvGraphicFramePr>
+              <a:graphicFrameLocks xmlns:a="http://schemas.openxmlformats.org/drawingml/2006/main" noChangeAspect="1"/>
+            </wp:cNvGraphicFramePr>
+            <a:graphic xmlns:a="http://schemas.openxmlformats.org/drawingml/2006/main">
+              <a:graphicData uri="http://schemas.openxmlformats.org/drawingml/2006/picture">
+                <pic:pic xmlns:pic="http://schemas.openxmlformats.org/drawingml/2006/picture">
+                  <pic:nvPicPr>
+                    <pic:cNvPr id="3" name="image3.png"/>
+                    <pic:cNvPicPr>
+                      <a:picLocks noChangeAspect="1" noChangeArrowheads="1"/>
+                    </pic:cNvPicPr>
+                  </pic:nvPicPr>
+                  <pic:blipFill>
+                    <a:blip r:embed="rId5"/>
+                    <a:srcRect/>
+                    <a:stretch>
+                      <a:fillRect/>
+                    </a:stretch>
+                  </pic:blipFill>
+                  <pic:spPr bwMode="auto">
+                    <a:xfrm>
+                      <a:off x="0" y="0"/>
+                      <a:ext cx="5940000" cy="2587535"/>
+                    </a:xfrm>
+                    <a:prstGeom prst="rect">
+                      <a:avLst/>
+                    </a:prstGeom>
+                  </pic:spPr>
+                </pic:pic>
+              </a:graphicData>
+            </a:graphic>
+          </wp:inline>
+        </w:drawing>
+      </w:r>
+    </w:p>
+    <w:p>
+      <w:pPr>
+        <w:spacing w:after="240"/>
+        <w:jc w:val="center"/>
+      </w:pPr>
+      <w:r>
+        <w:rPr>
+          <w:sz w:val="24"/>
+          <w:szCs w:val="24"/>
+          <w:lang w:val="ru-RU"/>
+        </w:rPr>
+        <w:t>Рисунок 3 - Модель княжества</w:t>
+      </w:r>
+    </w:p>
+    <w:p>
+      <w:pPr>
+        <w:keepNext/>
+        <w:spacing w:before="120" w:after="60"/>
+        <w:jc w:val="center"/>
+      </w:pPr>
+      <w:r>
+        <w:rPr>
+          <w:noProof/>
+        </w:rPr>
+        <w:drawing>
+          <wp:inline distT="0" distB="0" distL="0" distR="0">
+            <wp:extent cx="5940000" cy="7494300"/>
+            <wp:effectExtent l="0" t="0" r="0" b="0"/>
+            <wp:docPr id="104" name="Picture 3"/>
             <wp:cNvGraphicFramePr>
               <a:graphicFrameLocks xmlns:a="http://schemas.openxmlformats.org/drawingml/2006/main" noChangeAspect="1"/>
             </wp:cNvGraphicFramePr>
@@ -283,7 +347,7 @@
                   <pic:spPr bwMode="auto">
                     <a:xfrm>
                       <a:off x="0" y="0"/>
-                      <a:ext cx="5940000" cy="3339286"/>
+                      <a:ext cx="5940000" cy="7494300"/>
                     </a:xfrm>
                     <a:prstGeom prst="rect">
                       <a:avLst/>
@@ -307,7 +371,7 @@
           <w:szCs w:val="24"/>
           <w:lang w:val="ru-RU"/>
         </w:rPr>
-        <w:t xml:space="preserve">Рисунок 3 - Сериализатор и метод ленты</w:t>
+        <w:t>Рисунок 4 - Сериализатор и метод ленты</w:t>
       </w:r>
     </w:p>
     <w:p>
@@ -322,9 +386,9 @@
         </w:rPr>
         <w:drawing>
           <wp:inline distT="0" distB="0" distL="0" distR="0">
-            <wp:extent cx="5940000" cy="3339286"/>
+            <wp:extent cx="5940000" cy="5791499"/>
             <wp:effectExtent l="0" t="0" r="0" b="0"/>
-            <wp:docPr id="4" name="Picture 4"/>
+            <wp:docPr id="105" name="Picture 4"/>
             <wp:cNvGraphicFramePr>
               <a:graphicFrameLocks xmlns:a="http://schemas.openxmlformats.org/drawingml/2006/main" noChangeAspect="1"/>
             </wp:cNvGraphicFramePr>
@@ -347,7 +411,7 @@
                   <pic:spPr bwMode="auto">
                     <a:xfrm>
                       <a:off x="0" y="0"/>
-                      <a:ext cx="5940000" cy="3339286"/>
+                      <a:ext cx="5940000" cy="5791499"/>
                     </a:xfrm>
                     <a:prstGeom prst="rect">
                       <a:avLst/>
@@ -371,7 +435,7 @@
           <w:szCs w:val="24"/>
           <w:lang w:val="ru-RU"/>
         </w:rPr>
-        <w:t xml:space="preserve">Рисунок 4 - ORM-запросы ленты</w:t>
+        <w:t>Рисунок 5 - ORM-запросы ленты</w:t>
       </w:r>
     </w:p>
     <w:p>
@@ -415,13 +479,11 @@
           <w:bCs/>
           <w:lang w:val="ru-RU"/>
         </w:rPr>
-        <w:t xml:space="preserve">Сделано:</w:t>
-      </w:r>
-      <w:r>
-        <w:rPr>
-          <w:lang w:val="ru-RU"/>
-        </w:rPr>
-        <w:t xml:space="preserve"> страницы названы по теме, имена переносятся; пакеты сближены; линии к интерфейсам прямоугольные, подписи не перечёркнуты; у методов доменов указаны параметры и возвращаемые модели.</w:t>
+        <w:t>Сделано:</w:t>
+      </w:r>
+      <w:r>
+        <w:rPr/>
+        <w:t xml:space="preserve"> страницы названы по теме, имена переносятся; диаграмма перерисована по образцу и стала уже: методы доменов без аргументов, линии страниц сходятся в интерфейс, интерфейс соединён с доменом прямой линией.</w:t>
       </w:r>
     </w:p>
     <w:p>
@@ -436,9 +498,9 @@
         </w:rPr>
         <w:drawing>
           <wp:inline distT="0" distB="0" distL="0" distR="0">
-            <wp:extent cx="5940000" cy="3587113"/>
+            <wp:extent cx="5940000" cy="6657037"/>
             <wp:effectExtent l="0" t="0" r="0" b="0"/>
-            <wp:docPr id="5" name="Picture 5"/>
+            <wp:docPr id="106" name="Picture 5"/>
             <wp:cNvGraphicFramePr>
               <a:graphicFrameLocks xmlns:a="http://schemas.openxmlformats.org/drawingml/2006/main" noChangeAspect="1"/>
             </wp:cNvGraphicFramePr>
@@ -461,7 +523,7 @@
                   <pic:spPr bwMode="auto">
                     <a:xfrm>
                       <a:off x="0" y="0"/>
-                      <a:ext cx="5940000" cy="3587113"/>
+                      <a:ext cx="5940000" cy="6657037"/>
                     </a:xfrm>
                     <a:prstGeom prst="rect">
                       <a:avLst/>
@@ -485,7 +547,7 @@
           <w:szCs w:val="24"/>
           <w:lang w:val="ru-RU"/>
         </w:rPr>
-        <w:t xml:space="preserve">Рисунок 5 - Диаграмма классов</w:t>
+        <w:t>Рисунок 6 - Диаграмма классов</w:t>
       </w:r>
     </w:p>
     <w:sectPr>

</xml_diff>